<commit_message>
Regénération des docs et pdfs avec schémas
</commit_message>
<xml_diff>
--- a/_documents/Demineur_enonce.docx
+++ b/_documents/Demineur_enonce.docx
@@ -131,7 +131,28 @@
           <w:sz w:val="22"/>
           <w:szCs w:val="22"/>
         </w:rPr>
-        <w:t xml:space="preserve">Il n'y a rien à remettre et rien n'est évalué. Faites-le à votre rythme, après le thème FX, si vous voulez voir une application complète se construire autour d'un modèle que vous avez écrit et testé.</w:t>
+        <w:t xml:space="preserve">Il n'y a rien à remettre et rien n'est évalué. Faites-le seul, à votre rythme, si vous voulez voir une application complète se construire autour d'un modèle que vous avez écrit et testé.</w:t>
+      </w:r>
+    </w:p>
+    <w:p>
+      <w:pPr>
+        <w:spacing w:after="120"/>
+      </w:pPr>
+      <w:r>
+        <w:rPr>
+          <w:b/>
+          <w:bCs/>
+          <w:sz w:val="22"/>
+          <w:szCs w:val="22"/>
+        </w:rPr>
+        <w:t xml:space="preserve">Un corrigé est publié avec cet énoncé, dans un document séparé. </w:t>
+      </w:r>
+      <w:r>
+        <w:rPr>
+          <w:sz w:val="22"/>
+          <w:szCs w:val="22"/>
+        </w:rPr>
+        <w:t xml:space="preserve">Il donne une façon d'écrire chaque méthode, et répond aux questions posées en cours de route. Ne l'ouvrez qu'une fois les tests d'une étape au vert, pour comparer, ou si une étape vous résiste depuis un moment : c'est en cherchant que l'on apprend, pas en lisant la réponse.</w:t>
       </w:r>
     </w:p>
     <w:p>
@@ -662,7 +683,7 @@
           <w:sz w:val="22"/>
           <w:szCs w:val="22"/>
         </w:rPr>
-        <w:t xml:space="preserve">C'est ce qui la rend testable en une seconde, sans ouvrir de fenêtre, et c'est la séparation entre modèle et vue du deck FX2 : la vue demande, le modèle décide. Si vous vous surprenez à écrire « import javafx » dans Grille, arrêtez-vous : la question appartient à la vue.</w:t>
+        <w:t xml:space="preserve">C'est ce qui la rend testable en une seconde, sans ouvrir de fenêtre, et c'est la séparation entre modèle et vue : la vue demande, le modèle décide. Si vous vous surprenez à écrire « import javafx » dans Grille, arrêtez-vous : la question appartient à la vue.</w:t>
       </w:r>
     </w:p>
     <w:p>
@@ -713,7 +734,7 @@
           <w:sz w:val="22"/>
           <w:szCs w:val="22"/>
         </w:rPr>
-        <w:t xml:space="preserve">Les méthodes à écrire lèvent UnsupportedOperationException, avec l'étape qui les attend. Écrivez-les dans l'ordre des étapes.</w:t>
+        <w:t xml:space="preserve">Comme dans les fascicules, les méthodes à écrire lèvent UnsupportedOperationException ; le message dit l'étape qui les attend. Écrivez-les dans l'ordre des étapes.</w:t>
       </w:r>
     </w:p>
     <w:p>
@@ -804,8 +825,66 @@
       </w:r>
     </w:p>
     <w:p>
-      <w:r>
-        <w:br w:type="page"/>
+      <w:pPr>
+        <w:keepNext/>
+        <w:spacing w:after="40" w:before="120"/>
+        <w:jc w:val="center"/>
+      </w:pPr>
+      <w:r>
+        <w:drawing>
+          <wp:inline distT="0" distB="0" distL="0" distR="0">
+            <wp:extent cx="1905000" cy="2219325"/>
+            <wp:effectExtent t="0" r="0" b="0" l="0"/>
+            <wp:docPr id="1" name="" descr="" title=""/>
+            <wp:cNvGraphicFramePr>
+              <a:graphicFrameLocks xmlns:a="http://schemas.openxmlformats.org/drawingml/2006/main" noChangeAspect="1"/>
+            </wp:cNvGraphicFramePr>
+            <a:graphic xmlns:a="http://schemas.openxmlformats.org/drawingml/2006/main">
+              <a:graphicData uri="http://schemas.openxmlformats.org/drawingml/2006/picture">
+                <pic:pic xmlns:pic="http://schemas.openxmlformats.org/drawingml/2006/picture">
+                  <pic:nvPicPr>
+                    <pic:cNvPr id="0" name="" descr=""/>
+                    <pic:cNvPicPr>
+                      <a:picLocks noChangeAspect="1" noChangeArrowheads="1"/>
+                    </pic:cNvPicPr>
+                  </pic:nvPicPr>
+                  <pic:blipFill>
+                    <a:blip r:embed="rId7" cstate="none"/>
+                    <a:srcRect/>
+                    <a:stretch>
+                      <a:fillRect/>
+                    </a:stretch>
+                  </pic:blipFill>
+                  <pic:spPr bwMode="auto">
+                    <a:xfrm>
+                      <a:off x="0" y="0"/>
+                      <a:ext cx="1905000" cy="2219325"/>
+                    </a:xfrm>
+                    <a:prstGeom prst="rect">
+                      <a:avLst/>
+                    </a:prstGeom>
+                  </pic:spPr>
+                </pic:pic>
+              </a:graphicData>
+            </a:graphic>
+          </wp:inline>
+        </w:drawing>
+      </w:r>
+    </w:p>
+    <w:p>
+      <w:pPr>
+        <w:spacing w:after="160"/>
+        <w:jc w:val="center"/>
+      </w:pPr>
+      <w:r>
+        <w:rPr>
+          <w:i/>
+          <w:iCs/>
+          <w:color w:val="595959"/>
+          <w:sz w:val="18"/>
+          <w:szCs w:val="18"/>
+        </w:rPr>
+        <w:t xml:space="preserve">Une partie en cours : les chiffres comptent les mines voisines, les astérisques sont des drapeaux.</w:t>
       </w:r>
     </w:p>
     <w:p>
@@ -1475,6 +1554,53 @@
     </w:p>
     <w:p>
       <w:pPr>
+        <w:keepNext w:val="false"/>
+        <w:spacing w:after="160" w:before="120"/>
+        <w:jc w:val="center"/>
+      </w:pPr>
+      <w:r>
+        <w:drawing>
+          <wp:inline distT="0" distB="0" distL="0" distR="0">
+            <wp:extent cx="3810000" cy="1838325"/>
+            <wp:effectExtent t="0" r="0" b="0" l="0"/>
+            <wp:docPr id="1" name="" descr="" title=""/>
+            <wp:cNvGraphicFramePr>
+              <a:graphicFrameLocks xmlns:a="http://schemas.openxmlformats.org/drawingml/2006/main" noChangeAspect="1"/>
+            </wp:cNvGraphicFramePr>
+            <a:graphic xmlns:a="http://schemas.openxmlformats.org/drawingml/2006/main">
+              <a:graphicData uri="http://schemas.openxmlformats.org/drawingml/2006/picture">
+                <pic:pic xmlns:pic="http://schemas.openxmlformats.org/drawingml/2006/picture">
+                  <pic:nvPicPr>
+                    <pic:cNvPr id="0" name="" descr=""/>
+                    <pic:cNvPicPr>
+                      <a:picLocks noChangeAspect="1" noChangeArrowheads="1"/>
+                    </pic:cNvPicPr>
+                  </pic:nvPicPr>
+                  <pic:blipFill>
+                    <a:blip r:embed="rId8" cstate="none"/>
+                    <a:srcRect/>
+                    <a:stretch>
+                      <a:fillRect/>
+                    </a:stretch>
+                  </pic:blipFill>
+                  <pic:spPr bwMode="auto">
+                    <a:xfrm>
+                      <a:off x="0" y="0"/>
+                      <a:ext cx="3810000" cy="1838325"/>
+                    </a:xfrm>
+                    <a:prstGeom prst="rect">
+                      <a:avLst/>
+                    </a:prstGeom>
+                  </pic:spPr>
+                </pic:pic>
+              </a:graphicData>
+            </a:graphic>
+          </wp:inline>
+        </w:drawing>
+      </w:r>
+    </w:p>
+    <w:p>
+      <w:pPr>
         <w:spacing w:after="120"/>
       </w:pPr>
       <w:r>
@@ -1747,6 +1873,53 @@
     </w:p>
     <w:p>
       <w:pPr>
+        <w:keepNext w:val="false"/>
+        <w:spacing w:after="160" w:before="120"/>
+        <w:jc w:val="center"/>
+      </w:pPr>
+      <w:r>
+        <w:drawing>
+          <wp:inline distT="0" distB="0" distL="0" distR="0">
+            <wp:extent cx="4191000" cy="2228850"/>
+            <wp:effectExtent t="0" r="0" b="0" l="0"/>
+            <wp:docPr id="1" name="" descr="" title=""/>
+            <wp:cNvGraphicFramePr>
+              <a:graphicFrameLocks xmlns:a="http://schemas.openxmlformats.org/drawingml/2006/main" noChangeAspect="1"/>
+            </wp:cNvGraphicFramePr>
+            <a:graphic xmlns:a="http://schemas.openxmlformats.org/drawingml/2006/main">
+              <a:graphicData uri="http://schemas.openxmlformats.org/drawingml/2006/picture">
+                <pic:pic xmlns:pic="http://schemas.openxmlformats.org/drawingml/2006/picture">
+                  <pic:nvPicPr>
+                    <pic:cNvPr id="0" name="" descr=""/>
+                    <pic:cNvPicPr>
+                      <a:picLocks noChangeAspect="1" noChangeArrowheads="1"/>
+                    </pic:cNvPicPr>
+                  </pic:nvPicPr>
+                  <pic:blipFill>
+                    <a:blip r:embed="rId9" cstate="none"/>
+                    <a:srcRect/>
+                    <a:stretch>
+                      <a:fillRect/>
+                    </a:stretch>
+                  </pic:blipFill>
+                  <pic:spPr bwMode="auto">
+                    <a:xfrm>
+                      <a:off x="0" y="0"/>
+                      <a:ext cx="4191000" cy="2228850"/>
+                    </a:xfrm>
+                    <a:prstGeom prst="rect">
+                      <a:avLst/>
+                    </a:prstGeom>
+                  </pic:spPr>
+                </pic:pic>
+              </a:graphicData>
+            </a:graphic>
+          </wp:inline>
+        </w:drawing>
+      </w:r>
+    </w:p>
+    <w:p>
+      <w:pPr>
         <w:spacing w:after="120"/>
       </w:pPr>
       <w:r>
@@ -2250,7 +2423,115 @@
           <w:sz w:val="22"/>
           <w:szCs w:val="22"/>
         </w:rPr>
-        <w:t xml:space="preserve"> : une classe qui hérite d'Application refuse de démarrer quand Maven fournit JavaFX. La raison est dans le mémento technique, TEC-FX.4.</w:t>
+        <w:t xml:space="preserve">. Lancée directement, </w:t>
+      </w:r>
+      <w:r>
+        <w:rPr>
+          <w:rFonts w:ascii="Consolas" w:cs="Consolas" w:eastAsia="Consolas" w:hAnsi="Consolas"/>
+          <w:color w:val="8B2500"/>
+          <w:sz w:val="22"/>
+          <w:szCs w:val="22"/>
+        </w:rPr>
+        <w:t xml:space="preserve">Demineur</w:t>
+      </w:r>
+      <w:r>
+        <w:rPr>
+          <w:sz w:val="22"/>
+          <w:szCs w:val="22"/>
+        </w:rPr>
+        <w:t xml:space="preserve"> refuse de démarrer : elle hérite d'une classe de JavaFX, et le lanceur de Java exige alors que JavaFX soit chargé d'une manière que Maven ne prévoit pas. </w:t>
+      </w:r>
+      <w:r>
+        <w:rPr>
+          <w:rFonts w:ascii="Consolas" w:cs="Consolas" w:eastAsia="Consolas" w:hAnsi="Consolas"/>
+          <w:color w:val="8B2500"/>
+          <w:sz w:val="22"/>
+          <w:szCs w:val="22"/>
+        </w:rPr>
+        <w:t xml:space="preserve">LanceurDemineur</w:t>
+      </w:r>
+      <w:r>
+        <w:rPr>
+          <w:sz w:val="22"/>
+          <w:szCs w:val="22"/>
+        </w:rPr>
+        <w:t xml:space="preserve"> n'hérite de rien et se contente de démarrer </w:t>
+      </w:r>
+      <w:r>
+        <w:rPr>
+          <w:rFonts w:ascii="Consolas" w:cs="Consolas" w:eastAsia="Consolas" w:hAnsi="Consolas"/>
+          <w:color w:val="8B2500"/>
+          <w:sz w:val="22"/>
+          <w:szCs w:val="22"/>
+        </w:rPr>
+        <w:t xml:space="preserve">Demineur</w:t>
+      </w:r>
+      <w:r>
+        <w:rPr>
+          <w:sz w:val="22"/>
+          <w:szCs w:val="22"/>
+        </w:rPr>
+        <w:t xml:space="preserve"> : le contrôle ne se déclenche pas. Son commentaire en dit plus, et le mémento technique y revient en TEC-FX.4.</w:t>
+      </w:r>
+    </w:p>
+    <w:p>
+      <w:pPr>
+        <w:spacing w:after="120"/>
+      </w:pPr>
+      <w:r>
+        <w:rPr>
+          <w:sz w:val="22"/>
+          <w:szCs w:val="22"/>
+        </w:rPr>
+        <w:t xml:space="preserve">Si le lancement résiste malgré tout, passez par la fenêtre Maven d'IntelliJ : </w:t>
+      </w:r>
+      <w:r>
+        <w:rPr>
+          <w:rFonts w:ascii="Consolas" w:cs="Consolas" w:eastAsia="Consolas" w:hAnsi="Consolas"/>
+          <w:color w:val="8B2500"/>
+          <w:sz w:val="22"/>
+          <w:szCs w:val="22"/>
+        </w:rPr>
+        <w:t xml:space="preserve">Plugins</w:t>
+      </w:r>
+      <w:r>
+        <w:rPr>
+          <w:sz w:val="22"/>
+          <w:szCs w:val="22"/>
+        </w:rPr>
+        <w:t xml:space="preserve">, puis </w:t>
+      </w:r>
+      <w:r>
+        <w:rPr>
+          <w:rFonts w:ascii="Consolas" w:cs="Consolas" w:eastAsia="Consolas" w:hAnsi="Consolas"/>
+          <w:color w:val="8B2500"/>
+          <w:sz w:val="22"/>
+          <w:szCs w:val="22"/>
+        </w:rPr>
+        <w:t xml:space="preserve">javafx</w:t>
+      </w:r>
+      <w:r>
+        <w:rPr>
+          <w:sz w:val="22"/>
+          <w:szCs w:val="22"/>
+        </w:rPr>
+        <w:t xml:space="preserve">, puis </w:t>
+      </w:r>
+      <w:r>
+        <w:rPr>
+          <w:rFonts w:ascii="Consolas" w:cs="Consolas" w:eastAsia="Consolas" w:hAnsi="Consolas"/>
+          <w:color w:val="8B2500"/>
+          <w:sz w:val="22"/>
+          <w:szCs w:val="22"/>
+        </w:rPr>
+        <w:t xml:space="preserve">javafx:run</w:t>
+      </w:r>
+      <w:r>
+        <w:rPr>
+          <w:sz w:val="22"/>
+          <w:szCs w:val="22"/>
+        </w:rPr>
+        <w:t xml:space="preserve">.</w:t>
       </w:r>
     </w:p>
     <w:p>
@@ -2430,7 +2711,7 @@
       </w:r>
     </w:p>
     <w:sectPr>
-      <w:footerReference w:type="default" r:id="rId8"/>
+      <w:footerReference w:type="default" r:id="rId11"/>
       <w:pgSz w:w="11906" w:h="16838" w:orient="portrait"/>
       <w:pgMar w:top="1440" w:right="1440" w:bottom="1440" w:left="1440" w:header="708" w:footer="708" w:gutter="0"/>
       <w:pgNumType w:start="1"/>
@@ -2498,7 +2779,7 @@
         <w:szCs w:val="18"/>
         <w:color w:val="595959"/>
       </w:rPr>
-      <w:t xml:space="preserve">Demineur </w:t>
+      <w:t xml:space="preserve">Démineur </w:t>
     </w:r>
     <w:r>
       <w:fldChar w:fldCharType="begin"/>
@@ -2533,7 +2814,7 @@
       <w:fldChar w:fldCharType="separate"/>
     </w:r>
     <w:r>
-      <w:t>3</w:t>
+      <w:t>4</w:t>
     </w:r>
     <w:r>
       <w:fldChar w:fldCharType="end"/>

</xml_diff>